<commit_message>
fix document and database
</commit_message>
<xml_diff>
--- a/Report4_Software Design Document.docx
+++ b/Report4_Software Design Document.docx
@@ -25,12 +25,12 @@
           <wp:inline distB="0" distT="0" distL="0" distR="0">
             <wp:extent cx="2707537" cy="832092"/>
             <wp:effectExtent b="0" l="0" r="0" t="0"/>
-            <wp:docPr id="10" name="image8.png"/>
+            <wp:docPr id="13" name="image12.png"/>
             <a:graphic>
               <a:graphicData uri="http://schemas.openxmlformats.org/drawingml/2006/picture">
                 <pic:pic>
                   <pic:nvPicPr>
-                    <pic:cNvPr id="0" name="image8.png"/>
+                    <pic:cNvPr id="0" name="image12.png"/>
                     <pic:cNvPicPr preferRelativeResize="0"/>
                   </pic:nvPicPr>
                   <pic:blipFill>
@@ -392,7 +392,7 @@
     </w:p>
     <w:sdt>
       <w:sdtPr>
-        <w:id w:val="-306801063"/>
+        <w:id w:val="-141695320"/>
         <w:docPartObj>
           <w:docPartGallery w:val="Table of Contents"/>
           <w:docPartUnique w:val="1"/>
@@ -3479,12 +3479,12 @@
           <wp:inline distB="114300" distT="114300" distL="114300" distR="114300">
             <wp:extent cx="5943600" cy="4851400"/>
             <wp:effectExtent b="0" l="0" r="0" t="0"/>
-            <wp:docPr id="14" name="image5.png"/>
+            <wp:docPr id="20" name="image10.png"/>
             <a:graphic>
               <a:graphicData uri="http://schemas.openxmlformats.org/drawingml/2006/picture">
                 <pic:pic>
                   <pic:nvPicPr>
-                    <pic:cNvPr id="0" name="image5.png"/>
+                    <pic:cNvPr id="0" name="image10.png"/>
                     <pic:cNvPicPr preferRelativeResize="0"/>
                   </pic:nvPicPr>
                   <pic:blipFill>
@@ -4770,12 +4770,12 @@
           <wp:inline distB="114300" distT="114300" distL="114300" distR="114300">
             <wp:extent cx="5943600" cy="6477000"/>
             <wp:effectExtent b="0" l="0" r="0" t="0"/>
-            <wp:docPr id="13" name="image6.png"/>
+            <wp:docPr id="17" name="image14.png"/>
             <a:graphic>
               <a:graphicData uri="http://schemas.openxmlformats.org/drawingml/2006/picture">
                 <pic:pic>
                   <pic:nvPicPr>
-                    <pic:cNvPr id="0" name="image6.png"/>
+                    <pic:cNvPr id="0" name="image14.png"/>
                     <pic:cNvPicPr preferRelativeResize="0"/>
                   </pic:nvPicPr>
                   <pic:blipFill>
@@ -4886,11 +4886,16 @@
               <w:shd w:fill="auto" w:val="clear"/>
               <w:spacing w:after="0" w:before="120" w:line="276" w:lineRule="auto"/>
               <w:ind w:left="0" w:right="0" w:firstLine="0"/>
-              <w:jc w:val="left"/>
-              <w:rPr/>
-            </w:pPr>
-            <w:r>
-              <w:rPr>
+              <w:jc w:val="center"/>
+              <w:rPr>
+                <w:b w:val="1"/>
+                <w:bCs w:val="1"/>
+              </w:rPr>
+            </w:pPr>
+            <w:r>
+              <w:rPr>
+                <w:b w:val="1"/>
+                <w:bCs w:val="1"/>
                 <w:rtl w:val="0"/>
               </w:rPr>
               <w:t xml:space="preserve">No</w:t>
@@ -4917,11 +4922,16 @@
               <w:shd w:fill="auto" w:val="clear"/>
               <w:spacing w:after="0" w:before="120" w:line="276" w:lineRule="auto"/>
               <w:ind w:left="0" w:right="0" w:firstLine="0"/>
-              <w:jc w:val="left"/>
-              <w:rPr/>
-            </w:pPr>
-            <w:r>
-              <w:rPr>
+              <w:jc w:val="center"/>
+              <w:rPr>
+                <w:b w:val="1"/>
+                <w:bCs w:val="1"/>
+              </w:rPr>
+            </w:pPr>
+            <w:r>
+              <w:rPr>
+                <w:b w:val="1"/>
+                <w:bCs w:val="1"/>
                 <w:rtl w:val="0"/>
               </w:rPr>
               <w:t xml:space="preserve">Table</w:t>
@@ -4948,11 +4958,16 @@
               <w:shd w:fill="auto" w:val="clear"/>
               <w:spacing w:after="0" w:before="120" w:line="276" w:lineRule="auto"/>
               <w:ind w:left="0" w:right="0" w:firstLine="0"/>
-              <w:jc w:val="left"/>
-              <w:rPr/>
-            </w:pPr>
-            <w:r>
-              <w:rPr>
+              <w:jc w:val="center"/>
+              <w:rPr>
+                <w:b w:val="1"/>
+                <w:bCs w:val="1"/>
+              </w:rPr>
+            </w:pPr>
+            <w:r>
+              <w:rPr>
+                <w:b w:val="1"/>
+                <w:bCs w:val="1"/>
                 <w:rtl w:val="0"/>
               </w:rPr>
               <w:t xml:space="preserve">Description</w:t>
@@ -5889,7 +5904,7 @@
               <w:rPr>
                 <w:rtl w:val="0"/>
               </w:rPr>
-              <w:t xml:space="preserve">Ideal temperature, humidity, and CO₂ ranges for each mushroom type.</w:t>
+              <w:t xml:space="preserve">Ideal temperature, humidity ranges for each mushroom type.</w:t>
             </w:r>
           </w:p>
           <w:p>
@@ -9770,12 +9785,12 @@
           <wp:inline distB="114300" distT="114300" distL="114300" distR="114300">
             <wp:extent cx="4222161" cy="7843838"/>
             <wp:effectExtent b="0" l="0" r="0" t="0"/>
-            <wp:docPr id="7" name="image2.png"/>
+            <wp:docPr id="8" name="image1.png"/>
             <a:graphic>
               <a:graphicData uri="http://schemas.openxmlformats.org/drawingml/2006/picture">
                 <pic:pic>
                   <pic:nvPicPr>
-                    <pic:cNvPr id="0" name="image2.png"/>
+                    <pic:cNvPr id="0" name="image1.png"/>
                     <pic:cNvPicPr preferRelativeResize="0"/>
                   </pic:nvPicPr>
                   <pic:blipFill>
@@ -9826,12 +9841,12 @@
           <wp:inline distB="114300" distT="114300" distL="114300" distR="114300">
             <wp:extent cx="4347985" cy="7643813"/>
             <wp:effectExtent b="0" l="0" r="0" t="0"/>
-            <wp:docPr id="11" name="image7.png"/>
+            <wp:docPr id="14" name="image9.png"/>
             <a:graphic>
               <a:graphicData uri="http://schemas.openxmlformats.org/drawingml/2006/picture">
                 <pic:pic>
                   <pic:nvPicPr>
-                    <pic:cNvPr id="0" name="image7.png"/>
+                    <pic:cNvPr id="0" name="image9.png"/>
                     <pic:cNvPicPr preferRelativeResize="0"/>
                   </pic:nvPicPr>
                   <pic:blipFill>
@@ -9882,12 +9897,12 @@
           <wp:inline distB="114300" distT="114300" distL="114300" distR="114300">
             <wp:extent cx="5943600" cy="6146800"/>
             <wp:effectExtent b="0" l="0" r="0" t="0"/>
-            <wp:docPr id="8" name="image3.png"/>
+            <wp:docPr id="10" name="image8.png"/>
             <a:graphic>
               <a:graphicData uri="http://schemas.openxmlformats.org/drawingml/2006/picture">
                 <pic:pic>
                   <pic:nvPicPr>
-                    <pic:cNvPr id="0" name="image3.png"/>
+                    <pic:cNvPr id="0" name="image8.png"/>
                     <pic:cNvPicPr preferRelativeResize="0"/>
                   </pic:nvPicPr>
                   <pic:blipFill>
@@ -9938,12 +9953,12 @@
           <wp:inline distB="114300" distT="114300" distL="114300" distR="114300">
             <wp:extent cx="5943600" cy="9004300"/>
             <wp:effectExtent b="0" l="0" r="0" t="0"/>
-            <wp:docPr id="9" name="image4.png"/>
+            <wp:docPr id="12" name="image11.png"/>
             <a:graphic>
               <a:graphicData uri="http://schemas.openxmlformats.org/drawingml/2006/picture">
                 <pic:pic>
                   <pic:nvPicPr>
-                    <pic:cNvPr id="0" name="image4.png"/>
+                    <pic:cNvPr id="0" name="image11.png"/>
                     <pic:cNvPicPr preferRelativeResize="0"/>
                   </pic:nvPicPr>
                   <pic:blipFill>
@@ -9994,12 +10009,12 @@
           <wp:inline distB="114300" distT="114300" distL="114300" distR="114300">
             <wp:extent cx="5381444" cy="9072563"/>
             <wp:effectExtent b="0" l="0" r="0" t="0"/>
-            <wp:docPr id="12" name="image1.png"/>
+            <wp:docPr id="15" name="image6.png"/>
             <a:graphic>
               <a:graphicData uri="http://schemas.openxmlformats.org/drawingml/2006/picture">
                 <pic:pic>
                   <pic:nvPicPr>
-                    <pic:cNvPr id="0" name="image1.png"/>
+                    <pic:cNvPr id="0" name="image6.png"/>
                     <pic:cNvPicPr preferRelativeResize="0"/>
                   </pic:nvPicPr>
                   <pic:blipFill>
@@ -10033,13 +10048,7 @@
       <w:pPr>
         <w:pStyle w:val="Heading2"/>
         <w:spacing w:line="276" w:lineRule="auto"/>
-        <w:rPr>
-          <w:b w:val="1"/>
-          <w:bCs w:val="1"/>
-          <w:sz w:val="24"/>
-          <w:szCs w:val="24"/>
-          <w:u w:val="single"/>
-        </w:rPr>
+        <w:rPr/>
       </w:pPr>
       <w:bookmarkStart w:colFirst="0" w:colLast="0" w:name="_heading=h.quv0se2wlrkl" w:id="5"/>
       <w:bookmarkEnd w:id="5"/>
@@ -10047,8 +10056,1322 @@
         <w:rPr>
           <w:rtl w:val="0"/>
         </w:rPr>
-        <w:t xml:space="preserve">4. </w:t>
+        <w:t xml:space="preserve">4. State Machine Diagram</w:t>
       </w:r>
+    </w:p>
+    <w:p>
+      <w:pPr>
+        <w:rPr/>
+      </w:pPr>
+      <w:r>
+        <w:rPr/>
+        <w:drawing>
+          <wp:inline distB="114300" distT="114300" distL="114300" distR="114300">
+            <wp:extent cx="4519613" cy="7328531"/>
+            <wp:effectExtent b="0" l="0" r="0" t="0"/>
+            <wp:docPr id="7" name="image5.png"/>
+            <a:graphic>
+              <a:graphicData uri="http://schemas.openxmlformats.org/drawingml/2006/picture">
+                <pic:pic>
+                  <pic:nvPicPr>
+                    <pic:cNvPr id="0" name="image5.png"/>
+                    <pic:cNvPicPr preferRelativeResize="0"/>
+                  </pic:nvPicPr>
+                  <pic:blipFill>
+                    <a:blip r:embed="rId15"/>
+                    <a:srcRect b="0" l="0" r="0" t="0"/>
+                    <a:stretch>
+                      <a:fillRect/>
+                    </a:stretch>
+                  </pic:blipFill>
+                  <pic:spPr>
+                    <a:xfrm>
+                      <a:off x="0" y="0"/>
+                      <a:ext cx="4519613" cy="7328531"/>
+                    </a:xfrm>
+                    <a:prstGeom prst="rect"/>
+                    <a:ln/>
+                  </pic:spPr>
+                </pic:pic>
+              </a:graphicData>
+            </a:graphic>
+          </wp:inline>
+        </w:drawing>
+      </w:r>
+      <w:r>
+        <w:rPr>
+          <w:rtl w:val="0"/>
+        </w:rPr>
+      </w:r>
+    </w:p>
+    <w:p>
+      <w:pPr>
+        <w:rPr/>
+      </w:pPr>
+      <w:r>
+        <w:rPr/>
+        <w:drawing>
+          <wp:inline distB="114300" distT="114300" distL="114300" distR="114300">
+            <wp:extent cx="5943600" cy="3340100"/>
+            <wp:effectExtent b="0" l="0" r="0" t="0"/>
+            <wp:docPr id="11" name="image2.png"/>
+            <a:graphic>
+              <a:graphicData uri="http://schemas.openxmlformats.org/drawingml/2006/picture">
+                <pic:pic>
+                  <pic:nvPicPr>
+                    <pic:cNvPr id="0" name="image2.png"/>
+                    <pic:cNvPicPr preferRelativeResize="0"/>
+                  </pic:nvPicPr>
+                  <pic:blipFill>
+                    <a:blip r:embed="rId16"/>
+                    <a:srcRect b="0" l="0" r="0" t="0"/>
+                    <a:stretch>
+                      <a:fillRect/>
+                    </a:stretch>
+                  </pic:blipFill>
+                  <pic:spPr>
+                    <a:xfrm>
+                      <a:off x="0" y="0"/>
+                      <a:ext cx="5943600" cy="3340100"/>
+                    </a:xfrm>
+                    <a:prstGeom prst="rect"/>
+                    <a:ln/>
+                  </pic:spPr>
+                </pic:pic>
+              </a:graphicData>
+            </a:graphic>
+          </wp:inline>
+        </w:drawing>
+      </w:r>
+      <w:r>
+        <w:rPr>
+          <w:rtl w:val="0"/>
+        </w:rPr>
+      </w:r>
+    </w:p>
+    <w:p>
+      <w:pPr>
+        <w:rPr/>
+      </w:pPr>
+      <w:r>
+        <w:rPr/>
+        <w:drawing>
+          <wp:inline distB="114300" distT="114300" distL="114300" distR="114300">
+            <wp:extent cx="5943600" cy="2425700"/>
+            <wp:effectExtent b="0" l="0" r="0" t="0"/>
+            <wp:docPr id="19" name="image7.png"/>
+            <a:graphic>
+              <a:graphicData uri="http://schemas.openxmlformats.org/drawingml/2006/picture">
+                <pic:pic>
+                  <pic:nvPicPr>
+                    <pic:cNvPr id="0" name="image7.png"/>
+                    <pic:cNvPicPr preferRelativeResize="0"/>
+                  </pic:nvPicPr>
+                  <pic:blipFill>
+                    <a:blip r:embed="rId17"/>
+                    <a:srcRect b="0" l="0" r="0" t="0"/>
+                    <a:stretch>
+                      <a:fillRect/>
+                    </a:stretch>
+                  </pic:blipFill>
+                  <pic:spPr>
+                    <a:xfrm>
+                      <a:off x="0" y="0"/>
+                      <a:ext cx="5943600" cy="2425700"/>
+                    </a:xfrm>
+                    <a:prstGeom prst="rect"/>
+                    <a:ln/>
+                  </pic:spPr>
+                </pic:pic>
+              </a:graphicData>
+            </a:graphic>
+          </wp:inline>
+        </w:drawing>
+      </w:r>
+      <w:r>
+        <w:rPr>
+          <w:rtl w:val="0"/>
+        </w:rPr>
+      </w:r>
+    </w:p>
+    <w:p>
+      <w:pPr>
+        <w:rPr/>
+      </w:pPr>
+      <w:r>
+        <w:rPr/>
+        <w:drawing>
+          <wp:inline distB="114300" distT="114300" distL="114300" distR="114300">
+            <wp:extent cx="5943600" cy="3175000"/>
+            <wp:effectExtent b="0" l="0" r="0" t="0"/>
+            <wp:docPr id="16" name="image13.png"/>
+            <a:graphic>
+              <a:graphicData uri="http://schemas.openxmlformats.org/drawingml/2006/picture">
+                <pic:pic>
+                  <pic:nvPicPr>
+                    <pic:cNvPr id="0" name="image13.png"/>
+                    <pic:cNvPicPr preferRelativeResize="0"/>
+                  </pic:nvPicPr>
+                  <pic:blipFill>
+                    <a:blip r:embed="rId18"/>
+                    <a:srcRect b="0" l="0" r="0" t="0"/>
+                    <a:stretch>
+                      <a:fillRect/>
+                    </a:stretch>
+                  </pic:blipFill>
+                  <pic:spPr>
+                    <a:xfrm>
+                      <a:off x="0" y="0"/>
+                      <a:ext cx="5943600" cy="3175000"/>
+                    </a:xfrm>
+                    <a:prstGeom prst="rect"/>
+                    <a:ln/>
+                  </pic:spPr>
+                </pic:pic>
+              </a:graphicData>
+            </a:graphic>
+          </wp:inline>
+        </w:drawing>
+      </w:r>
+      <w:r>
+        <w:rPr>
+          <w:rtl w:val="0"/>
+        </w:rPr>
+      </w:r>
+    </w:p>
+    <w:p>
+      <w:pPr>
+        <w:rPr/>
+      </w:pPr>
+      <w:r>
+        <w:rPr/>
+        <w:drawing>
+          <wp:inline distB="114300" distT="114300" distL="114300" distR="114300">
+            <wp:extent cx="5943600" cy="3060700"/>
+            <wp:effectExtent b="0" l="0" r="0" t="0"/>
+            <wp:docPr id="9" name="image3.png"/>
+            <a:graphic>
+              <a:graphicData uri="http://schemas.openxmlformats.org/drawingml/2006/picture">
+                <pic:pic>
+                  <pic:nvPicPr>
+                    <pic:cNvPr id="0" name="image3.png"/>
+                    <pic:cNvPicPr preferRelativeResize="0"/>
+                  </pic:nvPicPr>
+                  <pic:blipFill>
+                    <a:blip r:embed="rId19"/>
+                    <a:srcRect b="0" l="0" r="0" t="0"/>
+                    <a:stretch>
+                      <a:fillRect/>
+                    </a:stretch>
+                  </pic:blipFill>
+                  <pic:spPr>
+                    <a:xfrm>
+                      <a:off x="0" y="0"/>
+                      <a:ext cx="5943600" cy="3060700"/>
+                    </a:xfrm>
+                    <a:prstGeom prst="rect"/>
+                    <a:ln/>
+                  </pic:spPr>
+                </pic:pic>
+              </a:graphicData>
+            </a:graphic>
+          </wp:inline>
+        </w:drawing>
+      </w:r>
+      <w:r>
+        <w:rPr>
+          <w:rtl w:val="0"/>
+        </w:rPr>
+      </w:r>
+    </w:p>
+    <w:p>
+      <w:pPr>
+        <w:rPr>
+          <w:b w:val="1"/>
+          <w:bCs w:val="1"/>
+          <w:i w:val="1"/>
+          <w:iCs w:val="1"/>
+          <w:sz w:val="24"/>
+          <w:szCs w:val="24"/>
+        </w:rPr>
+      </w:pPr>
+      <w:r>
+        <w:rPr/>
+        <w:drawing>
+          <wp:inline distB="114300" distT="114300" distL="114300" distR="114300">
+            <wp:extent cx="5943600" cy="2413000"/>
+            <wp:effectExtent b="0" l="0" r="0" t="0"/>
+            <wp:docPr id="18" name="image4.png"/>
+            <a:graphic>
+              <a:graphicData uri="http://schemas.openxmlformats.org/drawingml/2006/picture">
+                <pic:pic>
+                  <pic:nvPicPr>
+                    <pic:cNvPr id="0" name="image4.png"/>
+                    <pic:cNvPicPr preferRelativeResize="0"/>
+                  </pic:nvPicPr>
+                  <pic:blipFill>
+                    <a:blip r:embed="rId20"/>
+                    <a:srcRect b="0" l="0" r="0" t="0"/>
+                    <a:stretch>
+                      <a:fillRect/>
+                    </a:stretch>
+                  </pic:blipFill>
+                  <pic:spPr>
+                    <a:xfrm>
+                      <a:off x="0" y="0"/>
+                      <a:ext cx="5943600" cy="2413000"/>
+                    </a:xfrm>
+                    <a:prstGeom prst="rect"/>
+                    <a:ln/>
+                  </pic:spPr>
+                </pic:pic>
+              </a:graphicData>
+            </a:graphic>
+          </wp:inline>
+        </w:drawing>
+      </w:r>
+      <w:r>
+        <w:rPr>
+          <w:b w:val="1"/>
+          <w:bCs w:val="1"/>
+          <w:sz w:val="28"/>
+          <w:szCs w:val="28"/>
+          <w:rtl w:val="0"/>
+        </w:rPr>
+        <w:t xml:space="preserve">5. Technology Declaration</w:t>
+      </w:r>
+      <w:r>
+        <w:rPr>
+          <w:rtl w:val="0"/>
+        </w:rPr>
+      </w:r>
+    </w:p>
+    <w:tbl>
+      <w:tblPr>
+        <w:tblStyle w:val="Table4"/>
+        <w:tblW w:w="9960.0" w:type="dxa"/>
+        <w:jc w:val="left"/>
+        <w:tblInd w:w="-5.0" w:type="dxa"/>
+        <w:tblBorders>
+          <w:top w:color="000000" w:space="0" w:sz="4" w:val="single"/>
+          <w:left w:color="000000" w:space="0" w:sz="4" w:val="single"/>
+          <w:bottom w:color="000000" w:space="0" w:sz="4" w:val="single"/>
+          <w:right w:color="000000" w:space="0" w:sz="4" w:val="single"/>
+          <w:insideH w:color="000000" w:space="0" w:sz="4" w:val="single"/>
+          <w:insideV w:color="000000" w:space="0" w:sz="4" w:val="single"/>
+        </w:tblBorders>
+        <w:tblLayout w:type="fixed"/>
+        <w:tblLook w:val="0000"/>
+      </w:tblPr>
+      <w:tblGrid>
+        <w:gridCol w:w="1800"/>
+        <w:gridCol w:w="8160"/>
+        <w:tblGridChange w:id="0">
+          <w:tblGrid>
+            <w:gridCol w:w="1800"/>
+            <w:gridCol w:w="8160"/>
+          </w:tblGrid>
+        </w:tblGridChange>
+      </w:tblGrid>
+      <w:tr>
+        <w:trPr>
+          <w:cantSplit w:val="0"/>
+          <w:tblHeader w:val="0"/>
+        </w:trPr>
+        <w:tc>
+          <w:tcPr>
+            <w:shd w:fill="ffe8e1" w:val="clear"/>
+            <w:vAlign w:val="center"/>
+          </w:tcPr>
+          <w:p>
+            <w:pPr>
+              <w:keepNext w:val="0"/>
+              <w:keepLines w:val="0"/>
+              <w:widowControl w:val="1"/>
+              <w:pBdr>
+                <w:top w:space="0" w:sz="0" w:val="nil"/>
+                <w:left w:space="0" w:sz="0" w:val="nil"/>
+                <w:bottom w:space="0" w:sz="0" w:val="nil"/>
+                <w:right w:space="0" w:sz="0" w:val="nil"/>
+                <w:between w:space="0" w:sz="0" w:val="nil"/>
+              </w:pBdr>
+              <w:shd w:fill="auto" w:val="clear"/>
+              <w:spacing w:after="0" w:before="120" w:line="276" w:lineRule="auto"/>
+              <w:ind w:left="0" w:right="0" w:firstLine="0"/>
+              <w:jc w:val="center"/>
+              <w:rPr>
+                <w:b w:val="1"/>
+                <w:bCs w:val="1"/>
+              </w:rPr>
+            </w:pPr>
+            <w:r>
+              <w:rPr>
+                <w:b w:val="1"/>
+                <w:bCs w:val="1"/>
+                <w:rtl w:val="0"/>
+              </w:rPr>
+              <w:t xml:space="preserve">Group </w:t>
+            </w:r>
+          </w:p>
+        </w:tc>
+        <w:tc>
+          <w:tcPr>
+            <w:shd w:fill="ffe8e1" w:val="clear"/>
+            <w:vAlign w:val="center"/>
+          </w:tcPr>
+          <w:p>
+            <w:pPr>
+              <w:keepNext w:val="0"/>
+              <w:keepLines w:val="0"/>
+              <w:widowControl w:val="1"/>
+              <w:pBdr>
+                <w:top w:space="0" w:sz="0" w:val="nil"/>
+                <w:left w:space="0" w:sz="0" w:val="nil"/>
+                <w:bottom w:space="0" w:sz="0" w:val="nil"/>
+                <w:right w:space="0" w:sz="0" w:val="nil"/>
+                <w:between w:space="0" w:sz="0" w:val="nil"/>
+              </w:pBdr>
+              <w:shd w:fill="auto" w:val="clear"/>
+              <w:spacing w:after="0" w:before="120" w:line="276" w:lineRule="auto"/>
+              <w:ind w:left="0" w:right="0" w:firstLine="0"/>
+              <w:jc w:val="center"/>
+              <w:rPr>
+                <w:b w:val="1"/>
+                <w:bCs w:val="1"/>
+              </w:rPr>
+            </w:pPr>
+            <w:r>
+              <w:rPr>
+                <w:b w:val="1"/>
+                <w:bCs w:val="1"/>
+                <w:rtl w:val="0"/>
+              </w:rPr>
+              <w:t xml:space="preserve">Component</w:t>
+            </w:r>
+          </w:p>
+        </w:tc>
+      </w:tr>
+      <w:tr>
+        <w:trPr>
+          <w:cantSplit w:val="0"/>
+          <w:tblHeader w:val="0"/>
+        </w:trPr>
+        <w:tc>
+          <w:tcPr/>
+          <w:p>
+            <w:pPr>
+              <w:keepNext w:val="0"/>
+              <w:keepLines w:val="0"/>
+              <w:widowControl w:val="1"/>
+              <w:pBdr>
+                <w:top w:space="0" w:sz="0" w:val="nil"/>
+                <w:left w:space="0" w:sz="0" w:val="nil"/>
+                <w:bottom w:space="0" w:sz="0" w:val="nil"/>
+                <w:right w:space="0" w:sz="0" w:val="nil"/>
+                <w:between w:space="0" w:sz="0" w:val="nil"/>
+              </w:pBdr>
+              <w:shd w:fill="auto" w:val="clear"/>
+              <w:spacing w:after="0" w:before="120" w:line="276" w:lineRule="auto"/>
+              <w:ind w:left="0" w:right="0" w:firstLine="0"/>
+              <w:jc w:val="left"/>
+              <w:rPr>
+                <w:b w:val="1"/>
+                <w:bCs w:val="1"/>
+              </w:rPr>
+            </w:pPr>
+            <w:r>
+              <w:rPr>
+                <w:b w:val="1"/>
+                <w:bCs w:val="1"/>
+                <w:rtl w:val="0"/>
+              </w:rPr>
+              <w:t xml:space="preserve">Third-party services </w:t>
+            </w:r>
+          </w:p>
+        </w:tc>
+        <w:tc>
+          <w:tcPr/>
+          <w:p>
+            <w:pPr>
+              <w:keepNext w:val="0"/>
+              <w:keepLines w:val="0"/>
+              <w:widowControl w:val="1"/>
+              <w:pBdr>
+                <w:top w:space="0" w:sz="0" w:val="nil"/>
+                <w:left w:space="0" w:sz="0" w:val="nil"/>
+                <w:bottom w:space="0" w:sz="0" w:val="nil"/>
+                <w:right w:space="0" w:sz="0" w:val="nil"/>
+                <w:between w:space="0" w:sz="0" w:val="nil"/>
+              </w:pBdr>
+              <w:shd w:fill="auto" w:val="clear"/>
+              <w:spacing w:after="0" w:before="120" w:line="276" w:lineRule="auto"/>
+              <w:ind w:left="0" w:right="0" w:firstLine="0"/>
+              <w:jc w:val="left"/>
+              <w:rPr/>
+            </w:pPr>
+            <w:r>
+              <w:rPr>
+                <w:rtl w:val="0"/>
+              </w:rPr>
+              <w:t xml:space="preserve">Authentication: JWT (JSON Web Token) for user authentication and role-based authorization; passwords hashed with bcryptjs before being stored.</w:t>
+            </w:r>
+          </w:p>
+          <w:p>
+            <w:pPr>
+              <w:keepNext w:val="0"/>
+              <w:keepLines w:val="0"/>
+              <w:widowControl w:val="1"/>
+              <w:pBdr>
+                <w:top w:space="0" w:sz="0" w:val="nil"/>
+                <w:left w:space="0" w:sz="0" w:val="nil"/>
+                <w:bottom w:space="0" w:sz="0" w:val="nil"/>
+                <w:right w:space="0" w:sz="0" w:val="nil"/>
+                <w:between w:space="0" w:sz="0" w:val="nil"/>
+              </w:pBdr>
+              <w:shd w:fill="auto" w:val="clear"/>
+              <w:spacing w:after="0" w:before="120" w:line="276" w:lineRule="auto"/>
+              <w:ind w:left="0" w:right="0" w:firstLine="0"/>
+              <w:jc w:val="left"/>
+              <w:rPr/>
+            </w:pPr>
+            <w:r>
+              <w:rPr>
+                <w:rtl w:val="0"/>
+              </w:rPr>
+              <w:t xml:space="preserve">Storage: Cloudinary for images and media.</w:t>
+            </w:r>
+          </w:p>
+          <w:p>
+            <w:pPr>
+              <w:keepNext w:val="0"/>
+              <w:keepLines w:val="0"/>
+              <w:widowControl w:val="1"/>
+              <w:pBdr>
+                <w:top w:space="0" w:sz="0" w:val="nil"/>
+                <w:left w:space="0" w:sz="0" w:val="nil"/>
+                <w:bottom w:space="0" w:sz="0" w:val="nil"/>
+                <w:right w:space="0" w:sz="0" w:val="nil"/>
+                <w:between w:space="0" w:sz="0" w:val="nil"/>
+              </w:pBdr>
+              <w:shd w:fill="auto" w:val="clear"/>
+              <w:spacing w:after="0" w:before="120" w:line="276" w:lineRule="auto"/>
+              <w:ind w:left="0" w:right="0" w:firstLine="0"/>
+              <w:jc w:val="left"/>
+              <w:rPr/>
+            </w:pPr>
+            <w:r>
+              <w:rPr>
+                <w:rtl w:val="0"/>
+              </w:rPr>
+              <w:t xml:space="preserve">Payment: PayOS for payment processing and payment webhooks.</w:t>
+            </w:r>
+          </w:p>
+          <w:p>
+            <w:pPr>
+              <w:keepNext w:val="0"/>
+              <w:keepLines w:val="0"/>
+              <w:widowControl w:val="1"/>
+              <w:pBdr>
+                <w:top w:space="0" w:sz="0" w:val="nil"/>
+                <w:left w:space="0" w:sz="0" w:val="nil"/>
+                <w:bottom w:space="0" w:sz="0" w:val="nil"/>
+                <w:right w:space="0" w:sz="0" w:val="nil"/>
+                <w:between w:space="0" w:sz="0" w:val="nil"/>
+              </w:pBdr>
+              <w:shd w:fill="auto" w:val="clear"/>
+              <w:spacing w:after="0" w:before="120" w:line="276" w:lineRule="auto"/>
+              <w:ind w:left="0" w:right="0" w:firstLine="0"/>
+              <w:jc w:val="left"/>
+              <w:rPr/>
+            </w:pPr>
+            <w:r>
+              <w:rPr>
+                <w:rtl w:val="0"/>
+              </w:rPr>
+              <w:t xml:space="preserve">AI APIs: Google OAuth/Gmail API to authorize sending OTP emails; AI also supports automation tasks during development.</w:t>
+            </w:r>
+          </w:p>
+          <w:p>
+            <w:pPr>
+              <w:keepNext w:val="0"/>
+              <w:keepLines w:val="0"/>
+              <w:widowControl w:val="1"/>
+              <w:pBdr>
+                <w:top w:space="0" w:sz="0" w:val="nil"/>
+                <w:left w:space="0" w:sz="0" w:val="nil"/>
+                <w:bottom w:space="0" w:sz="0" w:val="nil"/>
+                <w:right w:space="0" w:sz="0" w:val="nil"/>
+                <w:between w:space="0" w:sz="0" w:val="nil"/>
+              </w:pBdr>
+              <w:shd w:fill="auto" w:val="clear"/>
+              <w:spacing w:after="0" w:before="120" w:line="276" w:lineRule="auto"/>
+              <w:ind w:left="0" w:right="0" w:firstLine="0"/>
+              <w:jc w:val="left"/>
+              <w:rPr/>
+            </w:pPr>
+            <w:r>
+              <w:rPr>
+                <w:rtl w:val="0"/>
+              </w:rPr>
+              <w:t xml:space="preserve">Database: PostgreSQL on Supabase (user data, system data, transaction history, application data).</w:t>
+            </w:r>
+          </w:p>
+          <w:p>
+            <w:pPr>
+              <w:keepNext w:val="0"/>
+              <w:keepLines w:val="0"/>
+              <w:widowControl w:val="1"/>
+              <w:pBdr>
+                <w:top w:space="0" w:sz="0" w:val="nil"/>
+                <w:left w:space="0" w:sz="0" w:val="nil"/>
+                <w:bottom w:space="0" w:sz="0" w:val="nil"/>
+                <w:right w:space="0" w:sz="0" w:val="nil"/>
+                <w:between w:space="0" w:sz="0" w:val="nil"/>
+              </w:pBdr>
+              <w:shd w:fill="auto" w:val="clear"/>
+              <w:spacing w:after="0" w:before="120" w:line="276" w:lineRule="auto"/>
+              <w:ind w:left="0" w:right="0" w:firstLine="0"/>
+              <w:jc w:val="left"/>
+              <w:rPr/>
+            </w:pPr>
+            <w:r>
+              <w:rPr>
+                <w:rtl w:val="0"/>
+              </w:rPr>
+              <w:t xml:space="preserve">Data/IoT: MQTT to connect IoT devices/sensors and monitor device status.</w:t>
+            </w:r>
+          </w:p>
+          <w:p>
+            <w:pPr>
+              <w:keepNext w:val="0"/>
+              <w:keepLines w:val="0"/>
+              <w:widowControl w:val="1"/>
+              <w:pBdr>
+                <w:top w:space="0" w:sz="0" w:val="nil"/>
+                <w:left w:space="0" w:sz="0" w:val="nil"/>
+                <w:bottom w:space="0" w:sz="0" w:val="nil"/>
+                <w:right w:space="0" w:sz="0" w:val="nil"/>
+                <w:between w:space="0" w:sz="0" w:val="nil"/>
+              </w:pBdr>
+              <w:shd w:fill="auto" w:val="clear"/>
+              <w:spacing w:after="0" w:before="120" w:line="276" w:lineRule="auto"/>
+              <w:ind w:left="0" w:right="0" w:firstLine="0"/>
+              <w:jc w:val="left"/>
+              <w:rPr/>
+            </w:pPr>
+            <w:r>
+              <w:rPr>
+                <w:rtl w:val="0"/>
+              </w:rPr>
+              <w:t xml:space="preserve">Data sent: user information, OTP codes, authentication tokens, images/media, payment data, sensor data, and device status.</w:t>
+            </w:r>
+          </w:p>
+        </w:tc>
+      </w:tr>
+      <w:tr>
+        <w:trPr>
+          <w:cantSplit w:val="0"/>
+          <w:tblHeader w:val="0"/>
+        </w:trPr>
+        <w:tc>
+          <w:tcPr/>
+          <w:p>
+            <w:pPr>
+              <w:keepNext w:val="0"/>
+              <w:keepLines w:val="0"/>
+              <w:widowControl w:val="1"/>
+              <w:pBdr>
+                <w:top w:space="0" w:sz="0" w:val="nil"/>
+                <w:left w:space="0" w:sz="0" w:val="nil"/>
+                <w:bottom w:space="0" w:sz="0" w:val="nil"/>
+                <w:right w:space="0" w:sz="0" w:val="nil"/>
+                <w:between w:space="0" w:sz="0" w:val="nil"/>
+              </w:pBdr>
+              <w:shd w:fill="auto" w:val="clear"/>
+              <w:spacing w:after="0" w:before="120" w:line="276" w:lineRule="auto"/>
+              <w:ind w:left="0" w:right="0" w:firstLine="0"/>
+              <w:jc w:val="left"/>
+              <w:rPr>
+                <w:b w:val="1"/>
+                <w:bCs w:val="1"/>
+              </w:rPr>
+            </w:pPr>
+            <w:r>
+              <w:rPr>
+                <w:b w:val="1"/>
+                <w:bCs w:val="1"/>
+                <w:rtl w:val="0"/>
+              </w:rPr>
+              <w:t xml:space="preserve">Development technologies</w:t>
+            </w:r>
+          </w:p>
+        </w:tc>
+        <w:tc>
+          <w:tcPr/>
+          <w:p>
+            <w:pPr>
+              <w:keepNext w:val="0"/>
+              <w:keepLines w:val="0"/>
+              <w:widowControl w:val="1"/>
+              <w:pBdr>
+                <w:top w:space="0" w:sz="0" w:val="nil"/>
+                <w:left w:space="0" w:sz="0" w:val="nil"/>
+                <w:bottom w:space="0" w:sz="0" w:val="nil"/>
+                <w:right w:space="0" w:sz="0" w:val="nil"/>
+                <w:between w:space="0" w:sz="0" w:val="nil"/>
+              </w:pBdr>
+              <w:shd w:fill="auto" w:val="clear"/>
+              <w:spacing w:after="0" w:before="120" w:line="276" w:lineRule="auto"/>
+              <w:ind w:left="0" w:right="0" w:firstLine="0"/>
+              <w:jc w:val="left"/>
+              <w:rPr/>
+            </w:pPr>
+            <w:r>
+              <w:rPr>
+                <w:rtl w:val="0"/>
+              </w:rPr>
+              <w:t xml:space="preserve">Front-end: Web/app client following a client-server architecture, interacting with the backend API.</w:t>
+            </w:r>
+          </w:p>
+          <w:p>
+            <w:pPr>
+              <w:keepNext w:val="0"/>
+              <w:keepLines w:val="0"/>
+              <w:widowControl w:val="1"/>
+              <w:pBdr>
+                <w:top w:space="0" w:sz="0" w:val="nil"/>
+                <w:left w:space="0" w:sz="0" w:val="nil"/>
+                <w:bottom w:space="0" w:sz="0" w:val="nil"/>
+                <w:right w:space="0" w:sz="0" w:val="nil"/>
+                <w:between w:space="0" w:sz="0" w:val="nil"/>
+              </w:pBdr>
+              <w:shd w:fill="auto" w:val="clear"/>
+              <w:spacing w:after="0" w:before="120" w:line="276" w:lineRule="auto"/>
+              <w:ind w:left="0" w:right="0" w:firstLine="0"/>
+              <w:jc w:val="left"/>
+              <w:rPr/>
+            </w:pPr>
+            <w:r>
+              <w:rPr>
+                <w:rtl w:val="0"/>
+              </w:rPr>
+              <w:t xml:space="preserve">Back-end: Node.js + Express.js for building the API, authentication, business logic, and database connectivity.</w:t>
+            </w:r>
+          </w:p>
+          <w:p>
+            <w:pPr>
+              <w:keepNext w:val="0"/>
+              <w:keepLines w:val="0"/>
+              <w:widowControl w:val="1"/>
+              <w:pBdr>
+                <w:top w:space="0" w:sz="0" w:val="nil"/>
+                <w:left w:space="0" w:sz="0" w:val="nil"/>
+                <w:bottom w:space="0" w:sz="0" w:val="nil"/>
+                <w:right w:space="0" w:sz="0" w:val="nil"/>
+                <w:between w:space="0" w:sz="0" w:val="nil"/>
+              </w:pBdr>
+              <w:shd w:fill="auto" w:val="clear"/>
+              <w:spacing w:after="0" w:before="120" w:line="276" w:lineRule="auto"/>
+              <w:ind w:left="0" w:right="0" w:firstLine="0"/>
+              <w:jc w:val="left"/>
+              <w:rPr/>
+            </w:pPr>
+            <w:r>
+              <w:rPr>
+                <w:rtl w:val="0"/>
+              </w:rPr>
+              <w:t xml:space="preserve">Mobile: Mobile apps (current or future) can be developed on top of the backend API.</w:t>
+            </w:r>
+          </w:p>
+          <w:p>
+            <w:pPr>
+              <w:keepNext w:val="0"/>
+              <w:keepLines w:val="0"/>
+              <w:widowControl w:val="1"/>
+              <w:pBdr>
+                <w:top w:space="0" w:sz="0" w:val="nil"/>
+                <w:left w:space="0" w:sz="0" w:val="nil"/>
+                <w:bottom w:space="0" w:sz="0" w:val="nil"/>
+                <w:right w:space="0" w:sz="0" w:val="nil"/>
+                <w:between w:space="0" w:sz="0" w:val="nil"/>
+              </w:pBdr>
+              <w:shd w:fill="auto" w:val="clear"/>
+              <w:spacing w:after="0" w:before="120" w:line="276" w:lineRule="auto"/>
+              <w:ind w:left="0" w:right="0" w:firstLine="0"/>
+              <w:jc w:val="left"/>
+              <w:rPr/>
+            </w:pPr>
+            <w:r>
+              <w:rPr>
+                <w:rtl w:val="0"/>
+              </w:rPr>
+              <w:t xml:space="preserve">Database: PostgreSQL on Supabase.</w:t>
+            </w:r>
+          </w:p>
+          <w:p>
+            <w:pPr>
+              <w:keepNext w:val="0"/>
+              <w:keepLines w:val="0"/>
+              <w:widowControl w:val="1"/>
+              <w:pBdr>
+                <w:top w:space="0" w:sz="0" w:val="nil"/>
+                <w:left w:space="0" w:sz="0" w:val="nil"/>
+                <w:bottom w:space="0" w:sz="0" w:val="nil"/>
+                <w:right w:space="0" w:sz="0" w:val="nil"/>
+                <w:between w:space="0" w:sz="0" w:val="nil"/>
+              </w:pBdr>
+              <w:shd w:fill="auto" w:val="clear"/>
+              <w:spacing w:after="0" w:before="120" w:line="276" w:lineRule="auto"/>
+              <w:ind w:left="0" w:right="0" w:firstLine="0"/>
+              <w:jc w:val="left"/>
+              <w:rPr/>
+            </w:pPr>
+            <w:r>
+              <w:rPr>
+                <w:rtl w:val="0"/>
+              </w:rPr>
+              <w:t xml:space="preserve">Cloud: Supabase, Cloudinary, Google API, PayOS.</w:t>
+            </w:r>
+          </w:p>
+          <w:p>
+            <w:pPr>
+              <w:keepNext w:val="0"/>
+              <w:keepLines w:val="0"/>
+              <w:widowControl w:val="1"/>
+              <w:pBdr>
+                <w:top w:space="0" w:sz="0" w:val="nil"/>
+                <w:left w:space="0" w:sz="0" w:val="nil"/>
+                <w:bottom w:space="0" w:sz="0" w:val="nil"/>
+                <w:right w:space="0" w:sz="0" w:val="nil"/>
+                <w:between w:space="0" w:sz="0" w:val="nil"/>
+              </w:pBdr>
+              <w:shd w:fill="auto" w:val="clear"/>
+              <w:spacing w:after="0" w:before="120" w:line="276" w:lineRule="auto"/>
+              <w:ind w:left="0" w:right="0" w:firstLine="0"/>
+              <w:jc w:val="left"/>
+              <w:rPr/>
+            </w:pPr>
+            <w:r>
+              <w:rPr>
+                <w:rtl w:val="0"/>
+              </w:rPr>
+              <w:t xml:space="preserve">Versions: Node.js (backend runtime), Express 5, PostgreSQL, JWT, bcryptjs, MQTT, Google APIs, Cloudinary.</w:t>
+            </w:r>
+          </w:p>
+        </w:tc>
+      </w:tr>
+      <w:tr>
+        <w:trPr>
+          <w:cantSplit w:val="0"/>
+          <w:tblHeader w:val="0"/>
+        </w:trPr>
+        <w:tc>
+          <w:tcPr/>
+          <w:p>
+            <w:pPr>
+              <w:keepNext w:val="0"/>
+              <w:keepLines w:val="0"/>
+              <w:widowControl w:val="1"/>
+              <w:pBdr>
+                <w:top w:space="0" w:sz="0" w:val="nil"/>
+                <w:left w:space="0" w:sz="0" w:val="nil"/>
+                <w:bottom w:space="0" w:sz="0" w:val="nil"/>
+                <w:right w:space="0" w:sz="0" w:val="nil"/>
+                <w:between w:space="0" w:sz="0" w:val="nil"/>
+              </w:pBdr>
+              <w:shd w:fill="auto" w:val="clear"/>
+              <w:spacing w:after="0" w:before="120" w:line="276" w:lineRule="auto"/>
+              <w:ind w:left="0" w:right="0" w:firstLine="0"/>
+              <w:jc w:val="left"/>
+              <w:rPr>
+                <w:b w:val="1"/>
+                <w:bCs w:val="1"/>
+              </w:rPr>
+            </w:pPr>
+            <w:r>
+              <w:rPr>
+                <w:b w:val="1"/>
+                <w:bCs w:val="1"/>
+                <w:rtl w:val="0"/>
+              </w:rPr>
+              <w:t xml:space="preserve">Source code &amp; DevOps</w:t>
+            </w:r>
+          </w:p>
+        </w:tc>
+        <w:tc>
+          <w:tcPr/>
+          <w:p>
+            <w:pPr>
+              <w:keepNext w:val="0"/>
+              <w:keepLines w:val="0"/>
+              <w:widowControl w:val="1"/>
+              <w:pBdr>
+                <w:top w:space="0" w:sz="0" w:val="nil"/>
+                <w:left w:space="0" w:sz="0" w:val="nil"/>
+                <w:bottom w:space="0" w:sz="0" w:val="nil"/>
+                <w:right w:space="0" w:sz="0" w:val="nil"/>
+                <w:between w:space="0" w:sz="0" w:val="nil"/>
+              </w:pBdr>
+              <w:shd w:fill="auto" w:val="clear"/>
+              <w:spacing w:after="0" w:before="120" w:line="276" w:lineRule="auto"/>
+              <w:ind w:left="0" w:right="0" w:firstLine="0"/>
+              <w:jc w:val="left"/>
+              <w:rPr/>
+            </w:pPr>
+            <w:r>
+              <w:rPr>
+                <w:rtl w:val="0"/>
+              </w:rPr>
+              <w:t xml:space="preserve">Platform: Git-based platform such as GitHub, GitLab, or Azure DevOps.</w:t>
+            </w:r>
+          </w:p>
+          <w:p>
+            <w:pPr>
+              <w:keepNext w:val="0"/>
+              <w:keepLines w:val="0"/>
+              <w:widowControl w:val="1"/>
+              <w:pBdr>
+                <w:top w:space="0" w:sz="0" w:val="nil"/>
+                <w:left w:space="0" w:sz="0" w:val="nil"/>
+                <w:bottom w:space="0" w:sz="0" w:val="nil"/>
+                <w:right w:space="0" w:sz="0" w:val="nil"/>
+                <w:between w:space="0" w:sz="0" w:val="nil"/>
+              </w:pBdr>
+              <w:shd w:fill="auto" w:val="clear"/>
+              <w:spacing w:after="0" w:before="120" w:line="276" w:lineRule="auto"/>
+              <w:ind w:left="0" w:right="0" w:firstLine="0"/>
+              <w:jc w:val="left"/>
+              <w:rPr/>
+            </w:pPr>
+            <w:r>
+              <w:rPr>
+                <w:rtl w:val="0"/>
+              </w:rPr>
+              <w:t xml:space="preserve">CI/CD: Automated pipeline triggered on code changes to build, test, and deploy.</w:t>
+            </w:r>
+          </w:p>
+          <w:p>
+            <w:pPr>
+              <w:keepNext w:val="0"/>
+              <w:keepLines w:val="0"/>
+              <w:widowControl w:val="1"/>
+              <w:pBdr>
+                <w:top w:space="0" w:sz="0" w:val="nil"/>
+                <w:left w:space="0" w:sz="0" w:val="nil"/>
+                <w:bottom w:space="0" w:sz="0" w:val="nil"/>
+                <w:right w:space="0" w:sz="0" w:val="nil"/>
+                <w:between w:space="0" w:sz="0" w:val="nil"/>
+              </w:pBdr>
+              <w:shd w:fill="auto" w:val="clear"/>
+              <w:spacing w:after="0" w:before="120" w:line="276" w:lineRule="auto"/>
+              <w:ind w:left="0" w:right="0" w:firstLine="0"/>
+              <w:jc w:val="left"/>
+              <w:rPr/>
+            </w:pPr>
+            <w:r>
+              <w:rPr>
+                <w:rtl w:val="0"/>
+              </w:rPr>
+              <w:t xml:space="preserve">Branching rules: main/master for production, develop for staging/testing, and feature branches for new work.</w:t>
+            </w:r>
+          </w:p>
+          <w:p>
+            <w:pPr>
+              <w:keepNext w:val="0"/>
+              <w:keepLines w:val="0"/>
+              <w:widowControl w:val="1"/>
+              <w:pBdr>
+                <w:top w:space="0" w:sz="0" w:val="nil"/>
+                <w:left w:space="0" w:sz="0" w:val="nil"/>
+                <w:bottom w:space="0" w:sz="0" w:val="nil"/>
+                <w:right w:space="0" w:sz="0" w:val="nil"/>
+                <w:between w:space="0" w:sz="0" w:val="nil"/>
+              </w:pBdr>
+              <w:shd w:fill="auto" w:val="clear"/>
+              <w:spacing w:after="0" w:before="120" w:line="276" w:lineRule="auto"/>
+              <w:ind w:left="0" w:right="0" w:firstLine="0"/>
+              <w:jc w:val="left"/>
+              <w:rPr/>
+            </w:pPr>
+            <w:r>
+              <w:rPr>
+                <w:rtl w:val="0"/>
+              </w:rPr>
+              <w:t xml:space="preserve">Quality control: Code review, error checking, and testing before merging into the main branch.</w:t>
+            </w:r>
+          </w:p>
+        </w:tc>
+      </w:tr>
+      <w:tr>
+        <w:trPr>
+          <w:cantSplit w:val="0"/>
+          <w:tblHeader w:val="0"/>
+        </w:trPr>
+        <w:tc>
+          <w:tcPr/>
+          <w:p>
+            <w:pPr>
+              <w:keepNext w:val="0"/>
+              <w:keepLines w:val="0"/>
+              <w:widowControl w:val="1"/>
+              <w:pBdr>
+                <w:top w:space="0" w:sz="0" w:val="nil"/>
+                <w:left w:space="0" w:sz="0" w:val="nil"/>
+                <w:bottom w:space="0" w:sz="0" w:val="nil"/>
+                <w:right w:space="0" w:sz="0" w:val="nil"/>
+                <w:between w:space="0" w:sz="0" w:val="nil"/>
+              </w:pBdr>
+              <w:shd w:fill="auto" w:val="clear"/>
+              <w:spacing w:after="0" w:before="120" w:line="276" w:lineRule="auto"/>
+              <w:ind w:left="0" w:right="0" w:firstLine="0"/>
+              <w:jc w:val="left"/>
+              <w:rPr>
+                <w:b w:val="1"/>
+                <w:bCs w:val="1"/>
+              </w:rPr>
+            </w:pPr>
+            <w:r>
+              <w:rPr>
+                <w:b w:val="1"/>
+                <w:bCs w:val="1"/>
+                <w:rtl w:val="0"/>
+              </w:rPr>
+              <w:t xml:space="preserve">Deployment environments</w:t>
+            </w:r>
+          </w:p>
+        </w:tc>
+        <w:tc>
+          <w:tcPr/>
+          <w:p>
+            <w:pPr>
+              <w:keepNext w:val="0"/>
+              <w:keepLines w:val="0"/>
+              <w:widowControl w:val="1"/>
+              <w:pBdr>
+                <w:top w:space="0" w:sz="0" w:val="nil"/>
+                <w:left w:space="0" w:sz="0" w:val="nil"/>
+                <w:bottom w:space="0" w:sz="0" w:val="nil"/>
+                <w:right w:space="0" w:sz="0" w:val="nil"/>
+                <w:between w:space="0" w:sz="0" w:val="nil"/>
+              </w:pBdr>
+              <w:shd w:fill="auto" w:val="clear"/>
+              <w:spacing w:after="0" w:before="120" w:line="276" w:lineRule="auto"/>
+              <w:ind w:left="0" w:right="0" w:firstLine="0"/>
+              <w:jc w:val="left"/>
+              <w:rPr/>
+            </w:pPr>
+            <w:r>
+              <w:rPr>
+                <w:rtl w:val="0"/>
+              </w:rPr>
+              <w:t xml:space="preserve">Environments: Dev (testing logic, APIs, and new features), Staging (pre-production testing), and Production (live for real users).</w:t>
+            </w:r>
+          </w:p>
+          <w:p>
+            <w:pPr>
+              <w:keepNext w:val="0"/>
+              <w:keepLines w:val="0"/>
+              <w:widowControl w:val="1"/>
+              <w:pBdr>
+                <w:top w:space="0" w:sz="0" w:val="nil"/>
+                <w:left w:space="0" w:sz="0" w:val="nil"/>
+                <w:bottom w:space="0" w:sz="0" w:val="nil"/>
+                <w:right w:space="0" w:sz="0" w:val="nil"/>
+                <w:between w:space="0" w:sz="0" w:val="nil"/>
+              </w:pBdr>
+              <w:shd w:fill="auto" w:val="clear"/>
+              <w:spacing w:after="0" w:before="120" w:line="276" w:lineRule="auto"/>
+              <w:ind w:left="0" w:right="0" w:firstLine="0"/>
+              <w:jc w:val="left"/>
+              <w:rPr/>
+            </w:pPr>
+            <w:r>
+              <w:rPr>
+                <w:rtl w:val="0"/>
+              </w:rPr>
+              <w:t xml:space="preserve">Deployment location: Cloud hosting or any platform supporting Node.js, PostgreSQL, and related services.</w:t>
+            </w:r>
+          </w:p>
+          <w:p>
+            <w:pPr>
+              <w:keepNext w:val="0"/>
+              <w:keepLines w:val="0"/>
+              <w:widowControl w:val="1"/>
+              <w:pBdr>
+                <w:top w:space="0" w:sz="0" w:val="nil"/>
+                <w:left w:space="0" w:sz="0" w:val="nil"/>
+                <w:bottom w:space="0" w:sz="0" w:val="nil"/>
+                <w:right w:space="0" w:sz="0" w:val="nil"/>
+                <w:between w:space="0" w:sz="0" w:val="nil"/>
+              </w:pBdr>
+              <w:shd w:fill="auto" w:val="clear"/>
+              <w:spacing w:after="0" w:before="120" w:line="276" w:lineRule="auto"/>
+              <w:ind w:left="0" w:right="0" w:firstLine="0"/>
+              <w:jc w:val="left"/>
+              <w:rPr/>
+            </w:pPr>
+            <w:r>
+              <w:rPr>
+                <w:rtl w:val="0"/>
+              </w:rPr>
+              <w:t xml:space="preserve">Deployment method: Automated build and deploy via CI/CD, with environment variables updated (e.g., JWT_SECRET, DATABASE_URL, PAYOS keys).</w:t>
+            </w:r>
+          </w:p>
+          <w:p>
+            <w:pPr>
+              <w:keepNext w:val="0"/>
+              <w:keepLines w:val="0"/>
+              <w:widowControl w:val="1"/>
+              <w:pBdr>
+                <w:top w:space="0" w:sz="0" w:val="nil"/>
+                <w:left w:space="0" w:sz="0" w:val="nil"/>
+                <w:bottom w:space="0" w:sz="0" w:val="nil"/>
+                <w:right w:space="0" w:sz="0" w:val="nil"/>
+                <w:between w:space="0" w:sz="0" w:val="nil"/>
+              </w:pBdr>
+              <w:shd w:fill="auto" w:val="clear"/>
+              <w:spacing w:after="0" w:before="120" w:line="276" w:lineRule="auto"/>
+              <w:ind w:left="0" w:right="0" w:firstLine="0"/>
+              <w:jc w:val="left"/>
+              <w:rPr/>
+            </w:pPr>
+            <w:r>
+              <w:rPr>
+                <w:rtl w:val="0"/>
+              </w:rPr>
+              <w:t xml:space="preserve">Rollback: Revert to the previous stable version by rolling back the release or the container/service.</w:t>
+            </w:r>
+          </w:p>
+        </w:tc>
+      </w:tr>
+      <w:tr>
+        <w:trPr>
+          <w:cantSplit w:val="0"/>
+          <w:tblHeader w:val="0"/>
+        </w:trPr>
+        <w:tc>
+          <w:tcPr/>
+          <w:p>
+            <w:pPr>
+              <w:keepNext w:val="0"/>
+              <w:keepLines w:val="0"/>
+              <w:widowControl w:val="1"/>
+              <w:pBdr>
+                <w:top w:space="0" w:sz="0" w:val="nil"/>
+                <w:left w:space="0" w:sz="0" w:val="nil"/>
+                <w:bottom w:space="0" w:sz="0" w:val="nil"/>
+                <w:right w:space="0" w:sz="0" w:val="nil"/>
+                <w:between w:space="0" w:sz="0" w:val="nil"/>
+              </w:pBdr>
+              <w:shd w:fill="auto" w:val="clear"/>
+              <w:spacing w:after="0" w:before="120" w:line="276" w:lineRule="auto"/>
+              <w:ind w:left="0" w:right="0" w:firstLine="0"/>
+              <w:jc w:val="left"/>
+              <w:rPr>
+                <w:b w:val="1"/>
+                <w:bCs w:val="1"/>
+              </w:rPr>
+            </w:pPr>
+            <w:r>
+              <w:rPr>
+                <w:b w:val="1"/>
+                <w:bCs w:val="1"/>
+                <w:rtl w:val="0"/>
+              </w:rPr>
+              <w:t xml:space="preserve">AI tools </w:t>
+            </w:r>
+          </w:p>
+        </w:tc>
+        <w:tc>
+          <w:tcPr/>
+          <w:p>
+            <w:pPr>
+              <w:keepNext w:val="0"/>
+              <w:keepLines w:val="0"/>
+              <w:widowControl w:val="1"/>
+              <w:pBdr>
+                <w:top w:space="0" w:sz="0" w:val="nil"/>
+                <w:left w:space="0" w:sz="0" w:val="nil"/>
+                <w:bottom w:space="0" w:sz="0" w:val="nil"/>
+                <w:right w:space="0" w:sz="0" w:val="nil"/>
+                <w:between w:space="0" w:sz="0" w:val="nil"/>
+              </w:pBdr>
+              <w:shd w:fill="auto" w:val="clear"/>
+              <w:spacing w:after="0" w:before="120" w:line="276" w:lineRule="auto"/>
+              <w:ind w:left="0" w:right="0" w:firstLine="0"/>
+              <w:jc w:val="left"/>
+              <w:rPr/>
+            </w:pPr>
+            <w:r>
+              <w:rPr>
+                <w:rtl w:val="0"/>
+              </w:rPr>
+              <w:t xml:space="preserve">Tools &amp; usage scope: AI assists across specification, design, coding, testing, and review; it helps create mockups, write APIs, suggest design solutions, generate test cases, review logic errors, and optimize performance.</w:t>
+            </w:r>
+          </w:p>
+          <w:p>
+            <w:pPr>
+              <w:keepNext w:val="0"/>
+              <w:keepLines w:val="0"/>
+              <w:widowControl w:val="1"/>
+              <w:pBdr>
+                <w:top w:space="0" w:sz="0" w:val="nil"/>
+                <w:left w:space="0" w:sz="0" w:val="nil"/>
+                <w:bottom w:space="0" w:sz="0" w:val="nil"/>
+                <w:right w:space="0" w:sz="0" w:val="nil"/>
+                <w:between w:space="0" w:sz="0" w:val="nil"/>
+              </w:pBdr>
+              <w:shd w:fill="auto" w:val="clear"/>
+              <w:spacing w:after="0" w:before="120" w:line="276" w:lineRule="auto"/>
+              <w:ind w:left="0" w:right="0" w:firstLine="0"/>
+              <w:jc w:val="left"/>
+              <w:rPr/>
+            </w:pPr>
+            <w:r>
+              <w:rPr>
+                <w:rtl w:val="0"/>
+              </w:rPr>
+              <w:t xml:space="preserve">Specification: Describing features and system requirements.</w:t>
+            </w:r>
+          </w:p>
+          <w:p>
+            <w:pPr>
+              <w:keepNext w:val="0"/>
+              <w:keepLines w:val="0"/>
+              <w:widowControl w:val="1"/>
+              <w:pBdr>
+                <w:top w:space="0" w:sz="0" w:val="nil"/>
+                <w:left w:space="0" w:sz="0" w:val="nil"/>
+                <w:bottom w:space="0" w:sz="0" w:val="nil"/>
+                <w:right w:space="0" w:sz="0" w:val="nil"/>
+                <w:between w:space="0" w:sz="0" w:val="nil"/>
+              </w:pBdr>
+              <w:shd w:fill="auto" w:val="clear"/>
+              <w:spacing w:after="0" w:before="120" w:line="276" w:lineRule="auto"/>
+              <w:ind w:left="0" w:right="0" w:firstLine="0"/>
+              <w:jc w:val="left"/>
+              <w:rPr/>
+            </w:pPr>
+            <w:r>
+              <w:rPr>
+                <w:rtl w:val="0"/>
+              </w:rPr>
+              <w:t xml:space="preserve">Design: Suggesting architecture, API contracts, and flow diagrams.</w:t>
+            </w:r>
+          </w:p>
+          <w:p>
+            <w:pPr>
+              <w:keepNext w:val="0"/>
+              <w:keepLines w:val="0"/>
+              <w:widowControl w:val="1"/>
+              <w:pBdr>
+                <w:top w:space="0" w:sz="0" w:val="nil"/>
+                <w:left w:space="0" w:sz="0" w:val="nil"/>
+                <w:bottom w:space="0" w:sz="0" w:val="nil"/>
+                <w:right w:space="0" w:sz="0" w:val="nil"/>
+                <w:between w:space="0" w:sz="0" w:val="nil"/>
+              </w:pBdr>
+              <w:shd w:fill="auto" w:val="clear"/>
+              <w:spacing w:after="0" w:before="120" w:line="276" w:lineRule="auto"/>
+              <w:ind w:left="0" w:right="0" w:firstLine="0"/>
+              <w:jc w:val="left"/>
+              <w:rPr/>
+            </w:pPr>
+            <w:r>
+              <w:rPr>
+                <w:rtl w:val="0"/>
+              </w:rPr>
+              <w:t xml:space="preserve">Code: Generating code, refactoring, writing utilities.</w:t>
+            </w:r>
+          </w:p>
+          <w:p>
+            <w:pPr>
+              <w:keepNext w:val="0"/>
+              <w:keepLines w:val="0"/>
+              <w:widowControl w:val="1"/>
+              <w:pBdr>
+                <w:top w:space="0" w:sz="0" w:val="nil"/>
+                <w:left w:space="0" w:sz="0" w:val="nil"/>
+                <w:bottom w:space="0" w:sz="0" w:val="nil"/>
+                <w:right w:space="0" w:sz="0" w:val="nil"/>
+                <w:between w:space="0" w:sz="0" w:val="nil"/>
+              </w:pBdr>
+              <w:shd w:fill="auto" w:val="clear"/>
+              <w:spacing w:after="0" w:before="120" w:line="276" w:lineRule="auto"/>
+              <w:ind w:left="0" w:right="0" w:firstLine="0"/>
+              <w:jc w:val="left"/>
+              <w:rPr/>
+            </w:pPr>
+            <w:r>
+              <w:rPr>
+                <w:rtl w:val="0"/>
+              </w:rPr>
+              <w:t xml:space="preserve">Testing: Creating test cases and checking edge cases.</w:t>
+            </w:r>
+          </w:p>
+          <w:p>
+            <w:pPr>
+              <w:keepNext w:val="0"/>
+              <w:keepLines w:val="0"/>
+              <w:widowControl w:val="1"/>
+              <w:pBdr>
+                <w:top w:space="0" w:sz="0" w:val="nil"/>
+                <w:left w:space="0" w:sz="0" w:val="nil"/>
+                <w:bottom w:space="0" w:sz="0" w:val="nil"/>
+                <w:right w:space="0" w:sz="0" w:val="nil"/>
+                <w:between w:space="0" w:sz="0" w:val="nil"/>
+              </w:pBdr>
+              <w:shd w:fill="auto" w:val="clear"/>
+              <w:spacing w:after="0" w:before="120" w:line="276" w:lineRule="auto"/>
+              <w:ind w:left="0" w:right="0" w:firstLine="0"/>
+              <w:jc w:val="left"/>
+              <w:rPr/>
+            </w:pPr>
+            <w:r>
+              <w:rPr>
+                <w:rtl w:val="0"/>
+              </w:rPr>
+              <w:t xml:space="preserve">Review: Detecting logic errors and improving code quality.</w:t>
+            </w:r>
+          </w:p>
+          <w:p>
+            <w:pPr>
+              <w:keepNext w:val="0"/>
+              <w:keepLines w:val="0"/>
+              <w:widowControl w:val="1"/>
+              <w:pBdr>
+                <w:top w:space="0" w:sz="0" w:val="nil"/>
+                <w:left w:space="0" w:sz="0" w:val="nil"/>
+                <w:bottom w:space="0" w:sz="0" w:val="nil"/>
+                <w:right w:space="0" w:sz="0" w:val="nil"/>
+                <w:between w:space="0" w:sz="0" w:val="nil"/>
+              </w:pBdr>
+              <w:shd w:fill="auto" w:val="clear"/>
+              <w:spacing w:after="0" w:before="120" w:line="276" w:lineRule="auto"/>
+              <w:ind w:left="0" w:right="0" w:firstLine="0"/>
+              <w:jc w:val="left"/>
+              <w:rPr/>
+            </w:pPr>
+            <w:r>
+              <w:rPr>
+                <w:rtl w:val="0"/>
+              </w:rPr>
+              <w:t xml:space="preserve">Goal: Speed up development, reduce errors, and improve software quality.</w:t>
+            </w:r>
+          </w:p>
+        </w:tc>
+      </w:tr>
+    </w:tbl>
+    <w:p>
+      <w:pPr>
+        <w:spacing w:line="276" w:lineRule="auto"/>
+        <w:rPr>
+          <w:b w:val="1"/>
+          <w:bCs w:val="1"/>
+          <w:sz w:val="28"/>
+          <w:szCs w:val="28"/>
+        </w:rPr>
+      </w:pPr>
       <w:r>
         <w:rPr>
           <w:rtl w:val="0"/>
@@ -10564,6 +11887,19 @@
       </w:tblCellMar>
     </w:tblPr>
   </w:style>
+  <w:style w:type="table" w:styleId="Table4">
+    <w:basedOn w:val="TableNormal"/>
+    <w:tblPr>
+      <w:tblStyleRowBandSize w:val="1"/>
+      <w:tblStyleColBandSize w:val="1"/>
+      <w:tblCellMar>
+        <w:top w:w="0.0" w:type="dxa"/>
+        <w:left w:w="115.0" w:type="dxa"/>
+        <w:bottom w:w="0.0" w:type="dxa"/>
+        <w:right w:w="115.0" w:type="dxa"/>
+      </w:tblCellMar>
+    </w:tblPr>
+  </w:style>
 </w:styles>
 </file>
 

</xml_diff>